<commit_message>
feat(personalization): simplify catalog review authorization
</commit_message>
<xml_diff>
--- a/docs/personalization/ContractToCozy-Personalization-Operations-Runbook.docx
+++ b/docs/personalization/ContractToCozy-Personalization-Operations-Runbook.docx
@@ -388,7 +388,7 @@
           <w:rFonts w:ascii="Calibri" w:hAnsi="Calibri"/>
           <w:sz w:val="22"/>
         </w:rPr>
-        <w:t>The initial catalog contains three deterministic maintenance definitions and five optional profile questions. All seeded rows start DRAFT.</w:t>
+        <w:t>The focused catalog contains five deterministic property definitions and five optional profile questions. All seeded rows start DRAFT.</w:t>
       </w:r>
     </w:p>
     <w:p>
@@ -746,7 +746,7 @@
                 <w:color w:val="0B2545"/>
                 <w:sz w:val="19"/>
               </w:rPr>
-              <w:t>Two active ADMIN users exist; reviewer can complete MFA.</w:t>
+              <w:t>One active ADMIN user can complete MFA and review catalog activation.</w:t>
             </w:r>
           </w:p>
         </w:tc>
@@ -772,7 +772,7 @@
                 <w:color w:val="0B2545"/>
                 <w:sz w:val="19"/>
               </w:rPr>
-              <w:t>Author / reviewer IDs: __________________</w:t>
+              <w:t>Reviewer ID: __________________</w:t>
             </w:r>
           </w:p>
         </w:tc>
@@ -1045,7 +1045,7 @@
           <w:rFonts w:ascii="Calibri" w:hAnsi="Calibri"/>
           <w:sz w:val="22"/>
         </w:rPr>
-        <w:t>Confirm three definitions/rules, three en-US content records, and five profile questions are present.</w:t>
+        <w:t>Confirm five definitions/rules, five en-US content records, and five profile questions are present.</w:t>
       </w:r>
     </w:p>
     <w:p>
@@ -1162,7 +1162,7 @@
           <w:rFonts w:ascii="Calibri" w:hAnsi="Calibri"/>
           <w:sz w:val="22"/>
         </w:rPr>
-        <w:t>Enter an active ADMIN author UUID. For SAFETY_SENSITIVE rules, the author and signed-in reviewer must be different people.</w:t>
+        <w:t>For SAFETY_SENSITIVE rules, read the stronger confirmation carefully and confirm that both the rule and content version were reviewed. No second admin identity is required.</w:t>
       </w:r>
     </w:p>
     <w:p>
@@ -1178,7 +1178,7 @@
           <w:rFonts w:ascii="Calibri" w:hAnsi="Calibri"/>
           <w:sz w:val="22"/>
         </w:rPr>
-        <w:t>Activate the bundle and confirm definition, rule, and content show ACTIVE and the definition is not paused.</w:t>
+        <w:t>Activate the bundle and confirm definition, rule, and content show ACTIVE, reviewedBy identifies the signed-in MFA admin, authoredBy is empty for system-seeded content, and the definition is not paused.</w:t>
       </w:r>
     </w:p>
     <w:p>
@@ -2388,7 +2388,7 @@
                 <w:color w:val="0B2545"/>
                 <w:sz w:val="19"/>
               </w:rPr>
-              <w:t>Distinct active ADMIN author and reviewer are proven for safety-sensitive rules.</w:t>
+              <w:t>MFA reviewer identity, explicit safety confirmation, and activation audit are verified.</w:t>
             </w:r>
           </w:p>
         </w:tc>
@@ -3359,7 +3359,7 @@
                 <w:color w:val="0B2545"/>
                 <w:sz w:val="19"/>
               </w:rPr>
-              <w:t>Correct, independently review, activate the intended version, then resume.</w:t>
+              <w:t>Correct, review through the MFA admin workflow, activate the intended version, then resume.</w:t>
             </w:r>
           </w:p>
         </w:tc>
@@ -3644,7 +3644,7 @@
         <w:br/>
         <w:t xml:space="preserve">       r.version AS rule_version, r.status AS rule_status,</w:t>
         <w:br/>
-        <w:t xml:space="preserve">       r."authoredBy", r."reviewedBy",</w:t>
+        <w:t xml:space="preserve">       r."reviewedBy",</w:t>
         <w:br/>
         <w:t xml:space="preserve">       c.locale, c.version AS content_version, c.status AS content_status</w:t>
         <w:br/>
@@ -3660,7 +3660,11 @@
         <w:br/>
         <w:t xml:space="preserve">  'smoke_co_detector_battery_check',</w:t>
         <w:br/>
-        <w:t xml:space="preserve">  'dryer_vent_cleaning_reminder'</w:t>
+        <w:t xml:space="preserve">  'dryer_vent_cleaning_reminder',</w:t>
+        <w:br/>
+        <w:t xml:space="preserve">  'smoke_detector_installation_review',</w:t>
+        <w:br/>
+        <w:t xml:space="preserve">  'aging_roof_condition_review'</w:t>
         <w:br/>
         <w:t>)</w:t>
         <w:br/>
@@ -3917,7 +3921,7 @@
                 <w:color w:val="0B2545"/>
                 <w:sz w:val="19"/>
               </w:rPr>
-              <w:t>AUTHOR_NOT_FOUND</w:t>
+              <w:t>Review and activate is disabled</w:t>
             </w:r>
           </w:p>
         </w:tc>
@@ -3943,7 +3947,7 @@
                 <w:color w:val="0B2545"/>
                 <w:sz w:val="19"/>
               </w:rPr>
-              <w:t>Email/wrong UUID, inactive user, or non-ADMIN.</w:t>
+              <w:t>Rule or en-US content is missing, or the bundle is already active.</w:t>
             </w:r>
           </w:p>
         </w:tc>
@@ -3969,7 +3973,7 @@
                 <w:color w:val="0B2545"/>
                 <w:sz w:val="19"/>
               </w:rPr>
-              <w:t>Use an active ADMIN UUID from the users table.</w:t>
+              <w:t>Run the canonical bootstrap if incomplete; otherwise inspect the displayed lifecycle state.</w:t>
             </w:r>
           </w:p>
         </w:tc>
@@ -4000,7 +4004,7 @@
                 <w:color w:val="0B2545"/>
                 <w:sz w:val="19"/>
               </w:rPr>
-              <w:t>TWO_PERSON_REVIEW_REQUIRED</w:t>
+              <w:t>Safety activation was canceled</w:t>
             </w:r>
           </w:p>
         </w:tc>
@@ -4026,7 +4030,7 @@
                 <w:color w:val="0B2545"/>
                 <w:sz w:val="19"/>
               </w:rPr>
-              <w:t>Safety rule author equals reviewer.</w:t>
+              <w:t>The signed-in admin did not confirm review of both displayed versions.</w:t>
             </w:r>
           </w:p>
         </w:tc>
@@ -4052,7 +4056,7 @@
                 <w:color w:val="0B2545"/>
                 <w:sz w:val="19"/>
               </w:rPr>
-              <w:t>Use a different active ADMIN author.</w:t>
+              <w:t>Re-read the rule and content, then accept the safety confirmation when ready.</w:t>
             </w:r>
           </w:p>
         </w:tc>
@@ -4422,7 +4426,7 @@
         <w:color w:val="5B6573"/>
         <w:sz w:val="17"/>
       </w:rPr>
-      <w:t>Internal reference  •  Updated July 14, 2026</w:t>
+      <w:t>Internal reference  •  Updated July 15, 2026</w:t>
       <w:tab/>
       <w:t xml:space="preserve">Page </w:t>
     </w:r>

</xml_diff>

<commit_message>
docs(personalization): clarify homeowner test path
</commit_message>
<xml_diff>
--- a/docs/personalization/ContractToCozy-Personalization-Operations-Runbook.docx
+++ b/docs/personalization/ContractToCozy-Personalization-Operations-Runbook.docx
@@ -1798,11 +1798,7 @@
         <w:spacing w:after="80" w:line="300" w:lineRule="auto"/>
       </w:pPr>
       <w:r>
-        <w:rPr>
-          <w:rFonts w:ascii="Calibri" w:hAnsi="Calibri"/>
-          <w:sz w:val="22"/>
-        </w:rPr>
-        <w:t>Open /dashboard/personalization?propertyId=&lt;property-id&gt; as the property owner. Confirm property-based guidance is available without enabling a household profile.</w:t>
+        <w:t>Make the disposable property the selected property and open Dashboard through normal homeowner navigation. Confirm Suggested for your home automatically shows property guidance without enabling a household profile; no direct personalization URL is required.</w:t>
       </w:r>
     </w:p>
     <w:p>
@@ -1814,11 +1810,7 @@
         <w:spacing w:after="80" w:line="300" w:lineRule="auto"/>
       </w:pPr>
       <w:r>
-        <w:rPr>
-          <w:rFonts w:ascii="Calibri" w:hAnsi="Calibri"/>
-          <w:sz w:val="22"/>
-        </w:rPr>
-        <w:t>Refresh after known matching evidence exists. Confirm each result has reviewed title, summary, and explanation content.</w:t>
+        <w:t>Open AI Tools → Personalized Home Guidance (or Maintenance → Personalization settings) to verify the same recommendation, explanation, and What personalization knows signal. Use Refresh only if facts changed while the page stayed open or for explicit QA recomputation.</w:t>
       </w:r>
     </w:p>
     <w:p>

</xml_diff>